<commit_message>
Add October 16 piano performance to website and CV
</commit_message>
<xml_diff>
--- a/content/cv-template.docx
+++ b/content/cv-template.docx
@@ -1785,6 +1785,27 @@
           <w:rFonts w:ascii="Noto Sans CJK JP" w:eastAsia="Noto Sans CJK JP" w:hAnsi="Noto Sans CJK JP" w:cs="Noto Sans CJK JP"/>
         </w:rPr>
         <w:t>Concerts and Performances</w:t>
+      </w:r>
+    </w:p>
+    <w:p>
+      <w:pPr>
+        <w:pStyle w:val="CVEntry"/>
+        <w:rPr>
+          <w:rFonts w:hint="eastAsia"/>
+        </w:rPr>
+      </w:pPr>
+      <w:r>
+        <w:rPr>
+          <w:rFonts w:eastAsia="Noto Sans CJK JP" w:cs="Noto Sans CJK JP"/>
+          <w:b/>
+        </w:rPr>
+        <w:t>2026 Oct 16</w:t>
+      </w:r>
+      <w:r>
+        <w:rPr>
+          <w:rFonts w:eastAsia="Noto Sans CJK JP" w:cs="Noto Sans CJK JP"/>
+        </w:rPr>
+        <w:t xml:space="preserve">  Piano Performance at the Banquet of the 66th Annual Meeting of the Japanese Society for Inherited Metabolic Diseases and the 21st Asian Symposium of Inherited Metabolic Diseases (Grand Hyatt Fukuoka)</w:t>
       </w:r>
     </w:p>
     <w:p>

</xml_diff>

<commit_message>
Show year only and omit venue for banquet piano performance
</commit_message>
<xml_diff>
--- a/content/cv-template.docx
+++ b/content/cv-template.docx
@@ -1799,13 +1799,13 @@
           <w:rFonts w:eastAsia="Noto Sans CJK JP" w:cs="Noto Sans CJK JP"/>
           <w:b/>
         </w:rPr>
-        <w:t>2026 Oct 16</w:t>
-      </w:r>
-      <w:r>
-        <w:rPr>
-          <w:rFonts w:eastAsia="Noto Sans CJK JP" w:cs="Noto Sans CJK JP"/>
-        </w:rPr>
-        <w:t xml:space="preserve">  Piano Performance at the Banquet of the 66th Annual Meeting of the Japanese Society for Inherited Metabolic Diseases and the 21st Asian Symposium of Inherited Metabolic Diseases (Grand Hyatt Fukuoka)</w:t>
+        <w:t>2026</w:t>
+      </w:r>
+      <w:r>
+        <w:rPr>
+          <w:rFonts w:eastAsia="Noto Sans CJK JP" w:cs="Noto Sans CJK JP"/>
+        </w:rPr>
+        <w:t xml:space="preserve">  Piano Performance at the Banquet of the 66th Annual Meeting of the Japanese Society for Inherited Metabolic Diseases and the 21st Asian Symposium of Inherited Metabolic Diseases</w:t>
       </w:r>
     </w:p>
     <w:p>

</xml_diff>

<commit_message>
Group 2026 piano performances under one year label
</commit_message>
<xml_diff>
--- a/content/cv-template.docx
+++ b/content/cv-template.docx
@@ -1807,47 +1807,23 @@
         </w:rPr>
         <w:t xml:space="preserve">  Piano Performance at the Banquet of the 66th Annual Meeting of the Japanese Society for Inherited Metabolic Diseases and the 21st Asian Symposium of Inherited Metabolic Diseases</w:t>
       </w:r>
-    </w:p>
-    <w:p>
-      <w:pPr>
-        <w:pStyle w:val="CVEntry"/>
-        <w:rPr>
-          <w:rFonts w:hint="eastAsia"/>
-        </w:rPr>
-      </w:pPr>
-      <w:r>
-        <w:rPr>
-          <w:rFonts w:eastAsia="Noto Sans CJK JP" w:cs="Noto Sans CJK JP"/>
-          <w:b/>
-        </w:rPr>
-        <w:t>2026</w:t>
-      </w:r>
-      <w:r>
-        <w:rPr>
-          <w:rFonts w:eastAsia="Noto Sans CJK JP" w:cs="Noto Sans CJK JP"/>
-        </w:rPr>
-        <w:t xml:space="preserve">  Ceremonial piano performance at the Retirement Party of Professor Hiroaki Ida, Kurume University School of Medicine</w:t>
-      </w:r>
-    </w:p>
-    <w:p>
-      <w:pPr>
-        <w:pStyle w:val="CVEntry"/>
-        <w:rPr>
-          <w:rFonts w:hint="eastAsia"/>
-        </w:rPr>
-      </w:pPr>
-      <w:r>
-        <w:rPr>
-          <w:rFonts w:eastAsia="Noto Sans CJK JP" w:cs="Noto Sans CJK JP"/>
-          <w:b/>
-        </w:rPr>
-        <w:t>2026</w:t>
-      </w:r>
-      <w:r>
-        <w:rPr>
-          <w:rFonts w:eastAsia="Noto Sans CJK JP" w:cs="Noto Sans CJK JP"/>
-        </w:rPr>
-        <w:t xml:space="preserve">  Ceremonial piano performance at the Annual Reunion Party of the Department of Radiology, Kurume University School of Medicine</w:t>
+      <w:r>
+        <w:br/>
+      </w:r>
+      <w:r>
+        <w:rPr>
+          <w:rFonts w:eastAsia="Noto Sans CJK JP" w:cs="Noto Sans CJK JP"/>
+        </w:rPr>
+        <w:t xml:space="preserve">Ceremonial piano performance at the Retirement Party of Professor Hiroaki Ida, Kurume University School of Medicine</w:t>
+      </w:r>
+      <w:r>
+        <w:br/>
+      </w:r>
+      <w:r>
+        <w:rPr>
+          <w:rFonts w:eastAsia="Noto Sans CJK JP" w:cs="Noto Sans CJK JP"/>
+        </w:rPr>
+        <w:t xml:space="preserve">Ceremonial piano performance at the Annual Reunion Party of the Department of Radiology, Kurume University School of Medicine</w:t>
       </w:r>
     </w:p>
     <w:p>

</xml_diff>